<commit_message>
Frente A: separar conteúdo do código — nova arquitetura content/JSON + motor de renderização
- Criar content/ com schema.json e 5 arquivos JSON de conteúdo (rinoplastia, blefaroplastia, ritidoplastia, otoplastia, abdominoplastia)
- Reescrever create_docx.js como motor de renderização puro (1347→430 linhas): lê JSON, gera .docx
- Descoberta automática de temas: novo JSON em content/ = novo documento disponível
- Atualizar CLAUDE.md com nova arquitetura e fluxo de atualização

Co-Authored-By: Claude Opus 4.6 <noreply@anthropic.com>
</commit_message>
<xml_diff>
--- a/01-Documentos-Estudo/12-1-Rinoplastia.docx
+++ b/01-Documentos-Estudo/12-1-Rinoplastia.docx
@@ -737,12 +737,6 @@
     </w:tbl>
     <w:p>
       <w:pPr>
-        <w:spacing w:after="100"/>
-      </w:pPr>
-      <w:r/>
-    </w:p>
-    <w:p>
-      <w:pPr>
         <w:pStyle w:val="Heading1"/>
         <w:spacing w:before="400" w:after="120"/>
       </w:pPr>
@@ -2486,12 +2480,6 @@
         </w:tc>
       </w:tr>
     </w:tbl>
-    <w:p>
-      <w:pPr>
-        <w:spacing w:after="100"/>
-      </w:pPr>
-      <w:r/>
-    </w:p>
     <w:p>
       <w:pPr>
         <w:pStyle w:val="Heading1"/>

</xml_diff>